<commit_message>
Expand research paper: diagrams, formal metric definitions, deeper results
Grows the paper from 9 to 13 pages:
- New Figure 1: end-to-end pipeline architecture diagram
- New Figure 2: Random Forest ensemble mechanism diagram (bootstrap
  samples -> trees -> majority vote), illustrating Breiman's method
- New Section 4.4 formally defines accuracy/precision/recall/F1/
  ROC-AUC with formulas and clinical rationale (recall as the
  critical metric for a screening tool)
- Results section restructured into 5.1-5.4: confusion matrix
  analysis (with false-negative vs false-positive cost discussion),
  ROC curve analysis (per-class AUC breakdown), feature importance
  analysis, and a literature comparison table against Debernardi
  et al.'s reported findings
- Embeds the actual confusion matrix, ROC curve, and feature
  importance plots as captioned figures

Co-Authored-By: Claude Sonnet 5 <noreply@anthropic.com>
Claude-Session: https://claude.ai/code/session_01CMkVmteteX65fXuoFCFHqx
</commit_message>
<xml_diff>
--- a/reports/research_paper.docx
+++ b/reports/research_paper.docx
@@ -111,7 +111,7 @@
           <w:sz w:val="22"/>
           <w:szCs w:val="22"/>
         </w:rPr>
-        <w:t xml:space="preserve">Pancreatic ductal adenocarcinoma (PDAC) has one of the lowest five-year survival rates of any cancer, primarily because it is typically diagnosed at an advanced, symptomatic stage. A low-cost, non-invasive screening approach based on urinary biomarkers could enable substantially earlier detection and improve clinical outcomes. This project develops and evaluates an end-to-end machine learning pipeline that classifies patients into three diagnostic categories — Control, Benign, and PDAC — using a panel of urinary and plasma biomarkers (CA19-9, creatinine, LYVE1, REG1B, TFF1, REG1A) together with patient age, sex, and sample-collection metadata. A Random Forest classifier is used as the sole data mining technique, combined with SMOTE-based oversampling and cost-sensitive class weighting to address class imbalance, and tuned via stratified cross-validated grid search. The resulting model achieves 91.5% test accuracy and a macro-averaged ROC-AUC of 0.983, with feature-importance analysis identifying REG1B, TFF1, and CA19-9 as the most diagnostically informative biomarkers. This report situates the work within the existing literature on urinary biomarker panels for pancreatic cancer and on Random Forest methodology, and discusses the pipeline's design decisions, results, limitations, and directions for future work.</w:t>
+        <w:t xml:space="preserve">Pancreatic ductal adenocarcinoma (PDAC) has one of the lowest five-year survival rates of any cancer, primarily because it is typically diagnosed at an advanced, symptomatic stage. A low-cost, non-invasive screening approach based on urinary biomarkers could enable substantially earlier detection and improve clinical outcomes. This project develops and evaluates an end-to-end machine learning pipeline that classifies patients into three diagnostic categories — Control, Benign, and PDAC — using a panel of urinary and plasma biomarkers (CA19-9, creatinine, LYVE1, REG1B, TFF1, REG1A) together with patient age, sex, and sample-collection metadata. A Random Forest classifier is used as the sole data mining technique, combined with SMOTE-based oversampling and cost-sensitive class weighting to address class imbalance, and tuned via stratified cross-validated grid search. The resulting model achieves 91.5% test accuracy and a macro-averaged ROC-AUC of 0.983, with feature-importance analysis identifying REG1B, TFF1, and CA19-9 as the most diagnostically informative biomarkers. This report situates the work within the existing literature on urinary biomarker panels for pancreatic cancer and on Random Forest methodology, and discusses the pipeline's architecture, results, evaluation methodology, limitations, and directions for future work in detail.</w:t>
       </w:r>
     </w:p>
     <w:p>
@@ -159,7 +159,7 @@
           <w:sz w:val="22"/>
           <w:szCs w:val="22"/>
         </w:rPr>
-        <w:t xml:space="preserve">The remainder of this report is organized as follows. Section 2 surveys the relevant medical and machine learning literature that informed the project's design. Section 3 describes the dataset and feature set. Section 4 details the proposed methodology, including preprocessing, class-imbalance handling, and hyperparameter tuning. Section 5 presents experimental results. Section 6 discusses limitations, and Section 7 concludes with directions for future work.</w:t>
+        <w:t xml:space="preserve">The remainder of this report is organized as follows. Section 2 surveys the relevant medical and machine learning literature that informed the project's design. Section 3 describes the dataset and feature set. Section 4 details the proposed methodology and pipeline architecture, including preprocessing, the Random Forest ensemble mechanism, class-imbalance handling, hyperparameter tuning, and the evaluation metrics used. Section 5 presents experimental results with supporting figures and a comparison against prior clinical literature. Section 6 discusses limitations, and Section 7 concludes with directions for future work.</w:t>
       </w:r>
     </w:p>
     <w:p>
@@ -269,7 +269,7 @@
           <w:sz w:val="22"/>
           <w:szCs w:val="22"/>
         </w:rPr>
-        <w:t xml:space="preserve">This work is the direct algorithmic foundation of the present project and shaped its design in two ways that map onto explicit constraints of the assignment. First, the assignment specifies Random Forest as the sole permitted data mining technique (no ensembling with other model families, no deep learning); Breiman's formulation is exactly the algorithm implemented via scikit-learn's RandomForestClassifier in this project's training pipeline, with hyperparameters (n_estimators, max_depth, min_samples_leaf, max_features) tuned by grid search as recommended by the bias–variance trade-offs the paper describes. Second, the paper's treatment of feature importance as a direct output of the ensemble — rather than requiring a separate post-hoc explainability method — is what makes it possible to answer this project's central clinical question (“which biomarkers matter most?”) using the classifier itself, and is the basis for the feature-importance analysis reported in Section 5.</w:t>
+        <w:t xml:space="preserve">This work is the direct algorithmic foundation of the present project and shaped its design in two ways that map onto explicit constraints of the assignment. First, the assignment specifies Random Forest as the sole permitted data mining technique (no ensembling with other model families, no deep learning); Breiman's formulation is exactly the algorithm implemented via scikit-learn's RandomForestClassifier in this project's training pipeline, with hyperparameters (n_estimators, max_depth, min_samples_leaf, max_features) tuned by grid search as recommended by the bias–variance trade-offs the paper describes. Second, the paper's treatment of feature importance as a direct output of the ensemble — rather than requiring a separate post-hoc explainability method — is what makes it possible to answer this project's central clinical question (“which biomarkers matter most?”) using the classifier itself, and is the basis for the feature-importance analysis reported in Section 5. Section 4.3 illustrates the ensemble mechanism this paper describes.</w:t>
       </w:r>
     </w:p>
     <w:p>
@@ -845,7 +845,94 @@
         <w:spacing w:after="160" w:before="320"/>
       </w:pPr>
       <w:r>
-        <w:t xml:space="preserve">4. Proposed Methodology</w:t>
+        <w:t xml:space="preserve">4. Proposed Methodology and Pipeline Architecture</w:t>
+      </w:r>
+    </w:p>
+    <w:p>
+      <w:pPr>
+        <w:spacing w:after="200" w:line="360"/>
+        <w:jc w:val="both"/>
+      </w:pPr>
+      <w:r>
+        <w:rPr>
+          <w:sz w:val="22"/>
+          <w:szCs w:val="22"/>
+        </w:rPr>
+        <w:t xml:space="preserve">The complete pipeline consists of five stages, illustrated in Figure 1: data loading, preprocessing, model training (with class-imbalance handling and hyperparameter tuning folded in), evaluation, and inference on new samples. Each stage is implemented as an independent, re-runnable script, and Random Forest is used as the sole data mining technique across the entire pipeline — no ensembling with other model families and no deep learning are used at any stage.</w:t>
+      </w:r>
+    </w:p>
+    <w:p>
+      <w:pPr>
+        <w:spacing w:after="60" w:before="160"/>
+        <w:jc w:val="center"/>
+      </w:pPr>
+      <w:r>
+        <w:drawing>
+          <wp:inline distT="0" distB="0" distL="0" distR="0">
+            <wp:extent cx="5715000" cy="1609725"/>
+            <wp:effectExtent t="0" r="0" b="0" l="0"/>
+            <wp:docPr id="1" name="" descr="" title=""/>
+            <wp:cNvGraphicFramePr>
+              <a:graphicFrameLocks xmlns:a="http://schemas.openxmlformats.org/drawingml/2006/main" noChangeAspect="1"/>
+            </wp:cNvGraphicFramePr>
+            <a:graphic xmlns:a="http://schemas.openxmlformats.org/drawingml/2006/main">
+              <a:graphicData uri="http://schemas.openxmlformats.org/drawingml/2006/picture">
+                <pic:pic xmlns:pic="http://schemas.openxmlformats.org/drawingml/2006/picture">
+                  <pic:nvPicPr>
+                    <pic:cNvPr id="0" name="" descr=""/>
+                    <pic:cNvPicPr>
+                      <a:picLocks noChangeAspect="1" noChangeArrowheads="1"/>
+                    </pic:cNvPicPr>
+                  </pic:nvPicPr>
+                  <pic:blipFill>
+                    <a:blip r:embed="rId7" cstate="none"/>
+                    <a:srcRect/>
+                    <a:stretch>
+                      <a:fillRect/>
+                    </a:stretch>
+                  </pic:blipFill>
+                  <pic:spPr bwMode="auto">
+                    <a:xfrm>
+                      <a:off x="0" y="0"/>
+                      <a:ext cx="5715000" cy="1609725"/>
+                    </a:xfrm>
+                    <a:prstGeom prst="rect">
+                      <a:avLst/>
+                    </a:prstGeom>
+                  </pic:spPr>
+                </pic:pic>
+              </a:graphicData>
+            </a:graphic>
+          </wp:inline>
+        </w:drawing>
+      </w:r>
+    </w:p>
+    <w:p>
+      <w:pPr>
+        <w:spacing w:after="220"/>
+        <w:jc w:val="center"/>
+      </w:pPr>
+      <w:r>
+        <w:rPr>
+          <w:b/>
+          <w:bCs/>
+          <w:i/>
+          <w:iCs/>
+          <w:color w:val="555555"/>
+          <w:sz w:val="18"/>
+          <w:szCs w:val="18"/>
+        </w:rPr>
+        <w:t xml:space="preserve">Figure 1. </w:t>
+      </w:r>
+      <w:r>
+        <w:rPr>
+          <w:i/>
+          <w:iCs/>
+          <w:color w:val="555555"/>
+          <w:sz w:val="18"/>
+          <w:szCs w:val="18"/>
+        </w:rPr>
+        <w:t xml:space="preserve">End-to-end pipeline architecture. Random Forest (stage 3) is the only data mining technique used.</w:t>
       </w:r>
     </w:p>
     <w:p>
@@ -983,7 +1070,94 @@
           <w:sz w:val="22"/>
           <w:szCs w:val="22"/>
         </w:rPr>
-        <w:t xml:space="preserve">Following Breiman [2], a Random Forest classifier is trained as the sole data mining technique specified for this project. Hyperparameters are tuned via GridSearchCV over stratified 5-fold cross-validation, optimizing macro-averaged F1-score — which weights all three diagnostic classes equally, appropriate given that missing a minority PDAC case is clinically more costly than an error on the majority classes. The search space covers the number of trees (n_estimators), maximum tree depth (max_depth), minimum leaf size (min_samples_leaf), and the number of features considered per split (max_features).</w:t>
+        <w:t xml:space="preserve">Following Breiman [2], a Random Forest classifier is trained as the sole data mining technique specified for this project. A Random Forest is an ensemble of decision trees: each tree is trained on an independent bootstrap sample drawn (with replacement) from the training data, and at every split each tree considers only a random subset of the available features rather than all of them. This double randomization — over both samples and features — decorrelates the individual trees, so that their errors are largely independent of one another. At prediction time, every tree casts a vote for a diagnostic class, and the forest's final prediction is the majority vote across all trees, as illustrated in Figure 2.</w:t>
+      </w:r>
+    </w:p>
+    <w:p>
+      <w:pPr>
+        <w:spacing w:after="60" w:before="160"/>
+        <w:jc w:val="center"/>
+      </w:pPr>
+      <w:r>
+        <w:drawing>
+          <wp:inline distT="0" distB="0" distL="0" distR="0">
+            <wp:extent cx="4572000" cy="2619375"/>
+            <wp:effectExtent t="0" r="0" b="0" l="0"/>
+            <wp:docPr id="2" name="" descr="" title=""/>
+            <wp:cNvGraphicFramePr>
+              <a:graphicFrameLocks xmlns:a="http://schemas.openxmlformats.org/drawingml/2006/main" noChangeAspect="1"/>
+            </wp:cNvGraphicFramePr>
+            <a:graphic xmlns:a="http://schemas.openxmlformats.org/drawingml/2006/main">
+              <a:graphicData uri="http://schemas.openxmlformats.org/drawingml/2006/picture">
+                <pic:pic xmlns:pic="http://schemas.openxmlformats.org/drawingml/2006/picture">
+                  <pic:nvPicPr>
+                    <pic:cNvPr id="0" name="" descr=""/>
+                    <pic:cNvPicPr>
+                      <a:picLocks noChangeAspect="1" noChangeArrowheads="1"/>
+                    </pic:cNvPicPr>
+                  </pic:nvPicPr>
+                  <pic:blipFill>
+                    <a:blip r:embed="rId8" cstate="none"/>
+                    <a:srcRect/>
+                    <a:stretch>
+                      <a:fillRect/>
+                    </a:stretch>
+                  </pic:blipFill>
+                  <pic:spPr bwMode="auto">
+                    <a:xfrm>
+                      <a:off x="0" y="0"/>
+                      <a:ext cx="4572000" cy="2619375"/>
+                    </a:xfrm>
+                    <a:prstGeom prst="rect">
+                      <a:avLst/>
+                    </a:prstGeom>
+                  </pic:spPr>
+                </pic:pic>
+              </a:graphicData>
+            </a:graphic>
+          </wp:inline>
+        </w:drawing>
+      </w:r>
+    </w:p>
+    <w:p>
+      <w:pPr>
+        <w:spacing w:after="220"/>
+        <w:jc w:val="center"/>
+      </w:pPr>
+      <w:r>
+        <w:rPr>
+          <w:b/>
+          <w:bCs/>
+          <w:i/>
+          <w:iCs/>
+          <w:color w:val="555555"/>
+          <w:sz w:val="18"/>
+          <w:szCs w:val="18"/>
+        </w:rPr>
+        <w:t xml:space="preserve">Figure 2. </w:t>
+      </w:r>
+      <w:r>
+        <w:rPr>
+          <w:i/>
+          <w:iCs/>
+          <w:color w:val="555555"/>
+          <w:sz w:val="18"/>
+          <w:szCs w:val="18"/>
+        </w:rPr>
+        <w:t xml:space="preserve">Random Forest ensemble mechanism: bootstrap-resampled training subsets, independently grown trees with randomized feature subsets, combined by majority vote.</w:t>
+      </w:r>
+    </w:p>
+    <w:p>
+      <w:pPr>
+        <w:spacing w:after="200" w:line="360"/>
+        <w:jc w:val="both"/>
+      </w:pPr>
+      <w:r>
+        <w:rPr>
+          <w:sz w:val="22"/>
+          <w:szCs w:val="22"/>
+        </w:rPr>
+        <w:t xml:space="preserve">Hyperparameters are tuned via GridSearchCV over stratified 5-fold cross-validation, optimizing macro-averaged F1-score — which weights all three diagnostic classes equally, appropriate given that missing a minority PDAC case is clinically more costly than an error on the majority classes. The search space covers the number of trees (n_estimators ∈ {100, 200, 400}), maximum tree depth (max_depth ∈ {None, 5, 10}), minimum leaf size (min_samples_leaf ∈ {1, 2, 4}), and the number of features considered per split (max_features ∈ {sqrt, log2}) — 54 candidate combinations evaluated across 5 folds, for 270 total model fits. The best configuration (n_estimators = 200, max_depth = 10, min_samples_leaf = 1, max_features = 'sqrt') achieved a cross-validated macro-F1 of 0.939.</w:t>
       </w:r>
     </w:p>
     <w:p>
@@ -992,7 +1166,7 @@
         <w:spacing w:after="120" w:before="260"/>
       </w:pPr>
       <w:r>
-        <w:t xml:space="preserve">4.4 Evaluation Protocol</w:t>
+        <w:t xml:space="preserve">4.4 Evaluation Metrics</w:t>
       </w:r>
     </w:p>
     <w:p>
@@ -1005,7 +1179,105 @@
           <w:sz w:val="22"/>
           <w:szCs w:val="22"/>
         </w:rPr>
-        <w:t xml:space="preserve">The held-out test partition is used exclusively for final evaluation and is never accessed during training or hyperparameter selection. Reported metrics include accuracy, per-class precision/recall/F1, macro-averaged one-vs-rest ROC-AUC, and the confusion matrix. Feature importance is extracted directly from the trained ensemble's Gini-based mean decrease in impurity, per Breiman's original formulation [2].</w:t>
+        <w:t xml:space="preserve">Model quality is quantified with five complementary metrics, each capturing a different aspect of classification performance:</w:t>
+      </w:r>
+    </w:p>
+    <w:p>
+      <w:pPr>
+        <w:pStyle w:val="ListParagraph"/>
+        <w:numPr>
+          <w:ilvl w:val="0"/>
+          <w:numId w:val="1"/>
+        </w:numPr>
+        <w:spacing w:after="120" w:line="320"/>
+      </w:pPr>
+      <w:r>
+        <w:rPr>
+          <w:sz w:val="22"/>
+          <w:szCs w:val="22"/>
+        </w:rPr>
+        <w:t xml:space="preserve">Accuracy = (TP + TN) / Total — the overall fraction of correct predictions; can be misleading on its own under class imbalance.</w:t>
+      </w:r>
+    </w:p>
+    <w:p>
+      <w:pPr>
+        <w:pStyle w:val="ListParagraph"/>
+        <w:numPr>
+          <w:ilvl w:val="0"/>
+          <w:numId w:val="1"/>
+        </w:numPr>
+        <w:spacing w:after="120" w:line="320"/>
+      </w:pPr>
+      <w:r>
+        <w:rPr>
+          <w:sz w:val="22"/>
+          <w:szCs w:val="22"/>
+        </w:rPr>
+        <w:t xml:space="preserve">Precision = TP / (TP + FP) — of samples predicted as a given class, the fraction that truly belong to it.</w:t>
+      </w:r>
+    </w:p>
+    <w:p>
+      <w:pPr>
+        <w:pStyle w:val="ListParagraph"/>
+        <w:numPr>
+          <w:ilvl w:val="0"/>
+          <w:numId w:val="1"/>
+        </w:numPr>
+        <w:spacing w:after="120" w:line="320"/>
+      </w:pPr>
+      <w:r>
+        <w:rPr>
+          <w:sz w:val="22"/>
+          <w:szCs w:val="22"/>
+        </w:rPr>
+        <w:t xml:space="preserve">Recall (sensitivity) = TP / (TP + FN) — of samples that truly belong to a class, the fraction correctly identified; the critical metric for a screening tool, since a false negative (a missed PDAC case) is the costliest possible error.</w:t>
+      </w:r>
+    </w:p>
+    <w:p>
+      <w:pPr>
+        <w:pStyle w:val="ListParagraph"/>
+        <w:numPr>
+          <w:ilvl w:val="0"/>
+          <w:numId w:val="1"/>
+        </w:numPr>
+        <w:spacing w:after="120" w:line="320"/>
+      </w:pPr>
+      <w:r>
+        <w:rPr>
+          <w:sz w:val="22"/>
+          <w:szCs w:val="22"/>
+        </w:rPr>
+        <w:t xml:space="preserve">F1-score = 2 · Precision · Recall / (Precision + Recall) — the harmonic mean of precision and recall; reported here as macro-F1, which averages the F1-score across all three classes with equal weight.</w:t>
+      </w:r>
+    </w:p>
+    <w:p>
+      <w:pPr>
+        <w:pStyle w:val="ListParagraph"/>
+        <w:numPr>
+          <w:ilvl w:val="0"/>
+          <w:numId w:val="1"/>
+        </w:numPr>
+        <w:spacing w:after="120" w:line="320"/>
+      </w:pPr>
+      <w:r>
+        <w:rPr>
+          <w:sz w:val="22"/>
+          <w:szCs w:val="22"/>
+        </w:rPr>
+        <w:t xml:space="preserve">ROC-AUC (one-vs-rest) — sweeps every possible decision threshold and plots the True Positive Rate against the False Positive Rate for each class treated as positive-vs-rest; the Area Under the Curve (0–1) summarizes ranking quality independent of any single threshold, with 0.5 corresponding to random guessing and 1.0 to perfect separation.</w:t>
+      </w:r>
+    </w:p>
+    <w:p>
+      <w:pPr>
+        <w:spacing w:after="200" w:line="360"/>
+        <w:jc w:val="both"/>
+      </w:pPr>
+      <w:r>
+        <w:rPr>
+          <w:sz w:val="22"/>
+          <w:szCs w:val="22"/>
+        </w:rPr>
+        <w:t xml:space="preserve">The held-out test partition is used exclusively for final evaluation and is never accessed during training or hyperparameter selection, so the metrics reported in Section 5 reflect genuine generalization performance rather than training fit. Feature importance is extracted directly from the trained ensemble's Gini-based mean decrease in impurity, per Breiman's original formulation [2].</w:t>
       </w:r>
     </w:p>
     <w:p>
@@ -1027,7 +1299,7 @@
           <w:sz w:val="22"/>
           <w:szCs w:val="22"/>
         </w:rPr>
-        <w:t xml:space="preserve">The tuned Random Forest (n_estimators = 200, max_depth = 10, min_samples_leaf = 1, max_features = 'sqrt') achieved a best cross-validated macro-F1 of 0.939 during grid search. On the held-out test partition, the model achieved the following performance:</w:t>
+        <w:t xml:space="preserve">The tuned Random Forest achieved a best cross-validated macro-F1 of 0.939 during grid search. On the held-out test partition (118 samples, never used in training or tuning), the model achieved the following per-class performance:</w:t>
       </w:r>
     </w:p>
     <w:tbl>
@@ -1598,7 +1870,90 @@
           <w:sz w:val="22"/>
           <w:szCs w:val="22"/>
         </w:rPr>
-        <w:t xml:space="preserve">Overall test accuracy was 91.5%, with a macro-averaged one-vs-rest ROC-AUC of 0.983. The confusion matrix shows that PDAC is rarely confused with Control — the clinically critical distinction for an early-screening use case — with most residual error occurring between the Benign and PDAC/Control classes, plausibly because certain benign hepatobiliary conditions produce biomarker elevations that partially overlap with malignant disease.</w:t>
+        <w:t xml:space="preserve">Overall test accuracy was 91.5%, with a macro-averaged one-vs-rest ROC-AUC of 0.983 and a macro-F1 of 0.917.</w:t>
+      </w:r>
+    </w:p>
+    <w:p>
+      <w:pPr>
+        <w:pStyle w:val="Heading2"/>
+        <w:spacing w:after="120" w:before="260"/>
+      </w:pPr>
+      <w:r>
+        <w:t xml:space="preserve">5.1 Confusion Matrix Analysis</w:t>
+      </w:r>
+    </w:p>
+    <w:p>
+      <w:pPr>
+        <w:spacing w:after="60" w:before="160"/>
+        <w:jc w:val="center"/>
+      </w:pPr>
+      <w:r>
+        <w:drawing>
+          <wp:inline distT="0" distB="0" distL="0" distR="0">
+            <wp:extent cx="3619500" cy="3019425"/>
+            <wp:effectExtent t="0" r="0" b="0" l="0"/>
+            <wp:docPr id="3" name="" descr="" title=""/>
+            <wp:cNvGraphicFramePr>
+              <a:graphicFrameLocks xmlns:a="http://schemas.openxmlformats.org/drawingml/2006/main" noChangeAspect="1"/>
+            </wp:cNvGraphicFramePr>
+            <a:graphic xmlns:a="http://schemas.openxmlformats.org/drawingml/2006/main">
+              <a:graphicData uri="http://schemas.openxmlformats.org/drawingml/2006/picture">
+                <pic:pic xmlns:pic="http://schemas.openxmlformats.org/drawingml/2006/picture">
+                  <pic:nvPicPr>
+                    <pic:cNvPr id="0" name="" descr=""/>
+                    <pic:cNvPicPr>
+                      <a:picLocks noChangeAspect="1" noChangeArrowheads="1"/>
+                    </pic:cNvPicPr>
+                  </pic:nvPicPr>
+                  <pic:blipFill>
+                    <a:blip r:embed="rId9" cstate="none"/>
+                    <a:srcRect/>
+                    <a:stretch>
+                      <a:fillRect/>
+                    </a:stretch>
+                  </pic:blipFill>
+                  <pic:spPr bwMode="auto">
+                    <a:xfrm>
+                      <a:off x="0" y="0"/>
+                      <a:ext cx="3619500" cy="3019425"/>
+                    </a:xfrm>
+                    <a:prstGeom prst="rect">
+                      <a:avLst/>
+                    </a:prstGeom>
+                  </pic:spPr>
+                </pic:pic>
+              </a:graphicData>
+            </a:graphic>
+          </wp:inline>
+        </w:drawing>
+      </w:r>
+    </w:p>
+    <w:p>
+      <w:pPr>
+        <w:spacing w:after="220"/>
+        <w:jc w:val="center"/>
+      </w:pPr>
+      <w:r>
+        <w:rPr>
+          <w:b/>
+          <w:bCs/>
+          <w:i/>
+          <w:iCs/>
+          <w:color w:val="555555"/>
+          <w:sz w:val="18"/>
+          <w:szCs w:val="18"/>
+        </w:rPr>
+        <w:t xml:space="preserve">Figure 3. </w:t>
+      </w:r>
+      <w:r>
+        <w:rPr>
+          <w:i/>
+          <w:iCs/>
+          <w:color w:val="555555"/>
+          <w:sz w:val="18"/>
+          <w:szCs w:val="18"/>
+        </w:rPr>
+        <w:t xml:space="preserve">Confusion matrix on the held-out test set (rows = true label, columns = predicted label).</w:t>
       </w:r>
     </w:p>
     <w:p>
@@ -1611,7 +1966,660 @@
           <w:sz w:val="22"/>
           <w:szCs w:val="22"/>
         </w:rPr>
-        <w:t xml:space="preserve">Feature-importance analysis (Gini-based mean decrease in impurity, per [2]) ranked REG1B (0.261), TFF1 (0.244), and plasma CA19-9 (0.185) as the three most predictive features, followed by LYVE1 (0.124) and REG1A (0.077). Demographic and batch/site metadata (age, sex, cohort, sample origin) contributed comparatively little to model decisions. This ranking is directionally consistent with the biomarker panel prioritization reported by Debernardi et al. [1], where REG1B and TFF1 similarly emerged as strong individual discriminators, lending face validity to the trained model's reliance on the intended biological signal rather than on collection artifacts.</w:t>
+        <w:t xml:space="preserve">The confusion matrix's diagonal represents correct predictions; off-diagonal cells represent misclassifications. Two properties stand out. First, PDAC is never confused with Control (0 of 40 PDAC samples predicted as Control) — the clinically critical distinction for an early-screening use case, since it means the model never mistakes a cancer patient for a fully healthy one. Second, the errors that do occur are asymmetric in clinical cost: 4 PDAC samples were predicted as Benign (false negatives), which is the costliest error type in a screening context because a missed PDAC case delays treatment; by contrast, 2 Benign samples were predicted as PDAC (false positives), a comparatively low-cost error since it triggers additional, safe clinical workup rather than a missed diagnosis. Most residual error sits between the Benign class and the other two classes, plausibly because certain benign hepatobiliary conditions produce biomarker elevations that partially overlap with malignant disease — an overlap also noted by Debernardi et al. [1].</w:t>
+      </w:r>
+    </w:p>
+    <w:p>
+      <w:pPr>
+        <w:pStyle w:val="Heading2"/>
+        <w:spacing w:after="120" w:before="260"/>
+      </w:pPr>
+      <w:r>
+        <w:t xml:space="preserve">5.2 ROC Curve Analysis</w:t>
+      </w:r>
+    </w:p>
+    <w:p>
+      <w:pPr>
+        <w:spacing w:after="60" w:before="160"/>
+        <w:jc w:val="center"/>
+      </w:pPr>
+      <w:r>
+        <w:drawing>
+          <wp:inline distT="0" distB="0" distL="0" distR="0">
+            <wp:extent cx="3619500" cy="3067050"/>
+            <wp:effectExtent t="0" r="0" b="0" l="0"/>
+            <wp:docPr id="4" name="" descr="" title=""/>
+            <wp:cNvGraphicFramePr>
+              <a:graphicFrameLocks xmlns:a="http://schemas.openxmlformats.org/drawingml/2006/main" noChangeAspect="1"/>
+            </wp:cNvGraphicFramePr>
+            <a:graphic xmlns:a="http://schemas.openxmlformats.org/drawingml/2006/main">
+              <a:graphicData uri="http://schemas.openxmlformats.org/drawingml/2006/picture">
+                <pic:pic xmlns:pic="http://schemas.openxmlformats.org/drawingml/2006/picture">
+                  <pic:nvPicPr>
+                    <pic:cNvPr id="0" name="" descr=""/>
+                    <pic:cNvPicPr>
+                      <a:picLocks noChangeAspect="1" noChangeArrowheads="1"/>
+                    </pic:cNvPicPr>
+                  </pic:nvPicPr>
+                  <pic:blipFill>
+                    <a:blip r:embed="rId10" cstate="none"/>
+                    <a:srcRect/>
+                    <a:stretch>
+                      <a:fillRect/>
+                    </a:stretch>
+                  </pic:blipFill>
+                  <pic:spPr bwMode="auto">
+                    <a:xfrm>
+                      <a:off x="0" y="0"/>
+                      <a:ext cx="3619500" cy="3067050"/>
+                    </a:xfrm>
+                    <a:prstGeom prst="rect">
+                      <a:avLst/>
+                    </a:prstGeom>
+                  </pic:spPr>
+                </pic:pic>
+              </a:graphicData>
+            </a:graphic>
+          </wp:inline>
+        </w:drawing>
+      </w:r>
+    </w:p>
+    <w:p>
+      <w:pPr>
+        <w:spacing w:after="220"/>
+        <w:jc w:val="center"/>
+      </w:pPr>
+      <w:r>
+        <w:rPr>
+          <w:b/>
+          <w:bCs/>
+          <w:i/>
+          <w:iCs/>
+          <w:color w:val="555555"/>
+          <w:sz w:val="18"/>
+          <w:szCs w:val="18"/>
+        </w:rPr>
+        <w:t xml:space="preserve">Figure 4. </w:t>
+      </w:r>
+      <w:r>
+        <w:rPr>
+          <w:i/>
+          <w:iCs/>
+          <w:color w:val="555555"/>
+          <w:sz w:val="18"/>
+          <w:szCs w:val="18"/>
+        </w:rPr>
+        <w:t xml:space="preserve">One-vs-rest ROC curves for each diagnostic class on the held-out test set.</w:t>
+      </w:r>
+    </w:p>
+    <w:p>
+      <w:pPr>
+        <w:spacing w:after="200" w:line="360"/>
+        <w:jc w:val="both"/>
+      </w:pPr>
+      <w:r>
+        <w:rPr>
+          <w:sz w:val="22"/>
+          <w:szCs w:val="22"/>
+        </w:rPr>
+        <w:t xml:space="preserve">Each curve treats one diagnostic class as positive against the other two combined, sweeping the decision threshold from 0 to 1. All three curves hug the top-left corner, indicating strong class separation at almost every threshold, not merely the conventional 0.5 cutoff. The Control class reaches a per-class AUC of 1.00, meaning the model perfectly ranks healthy patients above non-healthy ones by predicted probability across the test set. Benign has the lowest per-class AUC at 0.97, mirroring the confusion-matrix finding that Benign is the hardest class to isolate; PDAC sits at 0.98. The resulting macro-averaged AUC of 0.983 means that, averaged across the three classes, a randomly chosen true-positive sample is ranked above a randomly chosen true-negative sample 98.3% of the time — a strong result given the modest training-set size.</w:t>
+      </w:r>
+    </w:p>
+    <w:p>
+      <w:pPr>
+        <w:pStyle w:val="Heading2"/>
+        <w:spacing w:after="120" w:before="260"/>
+      </w:pPr>
+      <w:r>
+        <w:t xml:space="preserve">5.3 Feature Importance Analysis</w:t>
+      </w:r>
+    </w:p>
+    <w:p>
+      <w:pPr>
+        <w:spacing w:after="60" w:before="160"/>
+        <w:jc w:val="center"/>
+      </w:pPr>
+      <w:r>
+        <w:drawing>
+          <wp:inline distT="0" distB="0" distL="0" distR="0">
+            <wp:extent cx="4381500" cy="3286125"/>
+            <wp:effectExtent t="0" r="0" b="0" l="0"/>
+            <wp:docPr id="5" name="" descr="" title=""/>
+            <wp:cNvGraphicFramePr>
+              <a:graphicFrameLocks xmlns:a="http://schemas.openxmlformats.org/drawingml/2006/main" noChangeAspect="1"/>
+            </wp:cNvGraphicFramePr>
+            <a:graphic xmlns:a="http://schemas.openxmlformats.org/drawingml/2006/main">
+              <a:graphicData uri="http://schemas.openxmlformats.org/drawingml/2006/picture">
+                <pic:pic xmlns:pic="http://schemas.openxmlformats.org/drawingml/2006/picture">
+                  <pic:nvPicPr>
+                    <pic:cNvPr id="0" name="" descr=""/>
+                    <pic:cNvPicPr>
+                      <a:picLocks noChangeAspect="1" noChangeArrowheads="1"/>
+                    </pic:cNvPicPr>
+                  </pic:nvPicPr>
+                  <pic:blipFill>
+                    <a:blip r:embed="rId11" cstate="none"/>
+                    <a:srcRect/>
+                    <a:stretch>
+                      <a:fillRect/>
+                    </a:stretch>
+                  </pic:blipFill>
+                  <pic:spPr bwMode="auto">
+                    <a:xfrm>
+                      <a:off x="0" y="0"/>
+                      <a:ext cx="4381500" cy="3286125"/>
+                    </a:xfrm>
+                    <a:prstGeom prst="rect">
+                      <a:avLst/>
+                    </a:prstGeom>
+                  </pic:spPr>
+                </pic:pic>
+              </a:graphicData>
+            </a:graphic>
+          </wp:inline>
+        </w:drawing>
+      </w:r>
+    </w:p>
+    <w:p>
+      <w:pPr>
+        <w:spacing w:after="220"/>
+        <w:jc w:val="center"/>
+      </w:pPr>
+      <w:r>
+        <w:rPr>
+          <w:b/>
+          <w:bCs/>
+          <w:i/>
+          <w:iCs/>
+          <w:color w:val="555555"/>
+          <w:sz w:val="18"/>
+          <w:szCs w:val="18"/>
+        </w:rPr>
+        <w:t xml:space="preserve">Figure 5. </w:t>
+      </w:r>
+      <w:r>
+        <w:rPr>
+          <w:i/>
+          <w:iCs/>
+          <w:color w:val="555555"/>
+          <w:sz w:val="18"/>
+          <w:szCs w:val="18"/>
+        </w:rPr>
+        <w:t xml:space="preserve">Random Forest Gini-based feature importance, ranking which biomarkers the trained model relies on most.</w:t>
+      </w:r>
+    </w:p>
+    <w:p>
+      <w:pPr>
+        <w:spacing w:after="200" w:line="360"/>
+        <w:jc w:val="both"/>
+      </w:pPr>
+      <w:r>
+        <w:rPr>
+          <w:sz w:val="22"/>
+          <w:szCs w:val="22"/>
+        </w:rPr>
+        <w:t xml:space="preserve">Feature-importance analysis (Gini-based mean decrease in impurity, per Breiman [2]) ranked REG1B (0.261), TFF1 (0.244), and plasma CA19-9 (0.185) as the three most predictive features, followed by LYVE1 (0.124) and REG1A (0.077). Demographic and batch/site metadata (age, sex, cohort, sample origin) contributed comparatively little to model decisions — collectively under 4% of total importance — which is reassuring, since it indicates the model is relying on biomarker biology rather than on collection-site artifacts or demographic shortcuts.</w:t>
+      </w:r>
+    </w:p>
+    <w:p>
+      <w:pPr>
+        <w:pStyle w:val="Heading2"/>
+        <w:spacing w:after="120" w:before="260"/>
+      </w:pPr>
+      <w:r>
+        <w:t xml:space="preserve">5.4 Comparison with Prior Literature</w:t>
+      </w:r>
+    </w:p>
+    <w:p>
+      <w:pPr>
+        <w:spacing w:after="200" w:line="360"/>
+        <w:jc w:val="both"/>
+      </w:pPr>
+      <w:r>
+        <w:rPr>
+          <w:sz w:val="22"/>
+          <w:szCs w:val="22"/>
+        </w:rPr>
+        <w:t xml:space="preserve">Debernardi et al. [1] reported that REG1B and TFF1 were among the strongest individual discriminators in their urinary biomarker panel, and that CA19-9 alone under-performs a combined panel. The independently trained Random Forest in this project recovers the same ranking directly from its Gini-based feature importance, summarized in Table 2:</w:t>
+      </w:r>
+    </w:p>
+    <w:tbl>
+      <w:tblPr>
+        <w:tblW w:type="dxa" w:w="9360"/>
+        <w:tblBorders>
+          <w:top w:val="single" w:color="auto" w:sz="4"/>
+          <w:left w:val="single" w:color="auto" w:sz="4"/>
+          <w:bottom w:val="single" w:color="auto" w:sz="4"/>
+          <w:right w:val="single" w:color="auto" w:sz="4"/>
+          <w:insideH w:val="single" w:color="auto" w:sz="4"/>
+          <w:insideV w:val="single" w:color="auto" w:sz="4"/>
+        </w:tblBorders>
+      </w:tblPr>
+      <w:tblGrid>
+        <w:gridCol w:w="2400"/>
+        <w:gridCol w:w="3480"/>
+        <w:gridCol w:w="3480"/>
+      </w:tblGrid>
+      <w:tr>
+        <w:tc>
+          <w:tcPr>
+            <w:tcW w:type="dxa" w:w="2400"/>
+            <w:shd w:fill="2C1250" w:val="clear"/>
+            <w:tcMar>
+              <w:top w:type="dxa" w:w="100"/>
+              <w:left w:type="dxa" w:w="120"/>
+              <w:bottom w:type="dxa" w:w="100"/>
+              <w:right w:type="dxa" w:w="120"/>
+            </w:tcMar>
+          </w:tcPr>
+          <w:p>
+            <w:pPr>
+              <w:jc w:val="left"/>
+            </w:pPr>
+            <w:r>
+              <w:rPr>
+                <w:b/>
+                <w:bCs/>
+                <w:color w:val="FFFFFF"/>
+                <w:sz w:val="20"/>
+                <w:szCs w:val="20"/>
+              </w:rPr>
+              <w:t xml:space="preserve">Biomarker</w:t>
+            </w:r>
+          </w:p>
+        </w:tc>
+        <w:tc>
+          <w:tcPr>
+            <w:tcW w:type="dxa" w:w="3480"/>
+            <w:shd w:fill="2C1250" w:val="clear"/>
+            <w:tcMar>
+              <w:top w:type="dxa" w:w="100"/>
+              <w:left w:type="dxa" w:w="120"/>
+              <w:bottom w:type="dxa" w:w="100"/>
+              <w:right w:type="dxa" w:w="120"/>
+            </w:tcMar>
+          </w:tcPr>
+          <w:p>
+            <w:pPr>
+              <w:jc w:val="left"/>
+            </w:pPr>
+            <w:r>
+              <w:rPr>
+                <w:b/>
+                <w:bCs/>
+                <w:color w:val="FFFFFF"/>
+                <w:sz w:val="20"/>
+                <w:szCs w:val="20"/>
+              </w:rPr>
+              <w:t xml:space="preserve">This project's Gini importance</w:t>
+            </w:r>
+          </w:p>
+        </w:tc>
+        <w:tc>
+          <w:tcPr>
+            <w:tcW w:type="dxa" w:w="3480"/>
+            <w:shd w:fill="2C1250" w:val="clear"/>
+            <w:tcMar>
+              <w:top w:type="dxa" w:w="100"/>
+              <w:left w:type="dxa" w:w="120"/>
+              <w:bottom w:type="dxa" w:w="100"/>
+              <w:right w:type="dxa" w:w="120"/>
+            </w:tcMar>
+          </w:tcPr>
+          <w:p>
+            <w:pPr>
+              <w:jc w:val="left"/>
+            </w:pPr>
+            <w:r>
+              <w:rPr>
+                <w:b/>
+                <w:bCs/>
+                <w:color w:val="FFFFFF"/>
+                <w:sz w:val="20"/>
+                <w:szCs w:val="20"/>
+              </w:rPr>
+              <w:t xml:space="preserve">Debernardi et al. finding</w:t>
+            </w:r>
+          </w:p>
+        </w:tc>
+      </w:tr>
+      <w:tr>
+        <w:tc>
+          <w:tcPr>
+            <w:tcW w:type="dxa" w:w="2400"/>
+            <w:tcMar>
+              <w:top w:type="dxa" w:w="100"/>
+              <w:left w:type="dxa" w:w="120"/>
+              <w:bottom w:type="dxa" w:w="100"/>
+              <w:right w:type="dxa" w:w="120"/>
+            </w:tcMar>
+          </w:tcPr>
+          <w:p>
+            <w:pPr>
+              <w:jc w:val="left"/>
+            </w:pPr>
+            <w:r>
+              <w:rPr>
+                <w:b w:val="false"/>
+                <w:bCs w:val="false"/>
+                <w:color w:val="000000"/>
+                <w:sz w:val="20"/>
+                <w:szCs w:val="20"/>
+              </w:rPr>
+              <w:t xml:space="preserve">REG1B</w:t>
+            </w:r>
+          </w:p>
+        </w:tc>
+        <w:tc>
+          <w:tcPr>
+            <w:tcW w:type="dxa" w:w="3480"/>
+            <w:tcMar>
+              <w:top w:type="dxa" w:w="100"/>
+              <w:left w:type="dxa" w:w="120"/>
+              <w:bottom w:type="dxa" w:w="100"/>
+              <w:right w:type="dxa" w:w="120"/>
+            </w:tcMar>
+          </w:tcPr>
+          <w:p>
+            <w:pPr>
+              <w:jc w:val="left"/>
+            </w:pPr>
+            <w:r>
+              <w:rPr>
+                <w:b w:val="false"/>
+                <w:bCs w:val="false"/>
+                <w:color w:val="000000"/>
+                <w:sz w:val="20"/>
+                <w:szCs w:val="20"/>
+              </w:rPr>
+              <w:t xml:space="preserve">0.261 (rank 1)</w:t>
+            </w:r>
+          </w:p>
+        </w:tc>
+        <w:tc>
+          <w:tcPr>
+            <w:tcW w:type="dxa" w:w="3480"/>
+            <w:tcMar>
+              <w:top w:type="dxa" w:w="100"/>
+              <w:left w:type="dxa" w:w="120"/>
+              <w:bottom w:type="dxa" w:w="100"/>
+              <w:right w:type="dxa" w:w="120"/>
+            </w:tcMar>
+          </w:tcPr>
+          <w:p>
+            <w:pPr>
+              <w:jc w:val="left"/>
+            </w:pPr>
+            <w:r>
+              <w:rPr>
+                <w:b w:val="false"/>
+                <w:bCs w:val="false"/>
+                <w:color w:val="000000"/>
+                <w:sz w:val="20"/>
+                <w:szCs w:val="20"/>
+              </w:rPr>
+              <w:t xml:space="preserve">Among top discriminators</w:t>
+            </w:r>
+          </w:p>
+        </w:tc>
+      </w:tr>
+      <w:tr>
+        <w:tc>
+          <w:tcPr>
+            <w:tcW w:type="dxa" w:w="2400"/>
+            <w:tcMar>
+              <w:top w:type="dxa" w:w="100"/>
+              <w:left w:type="dxa" w:w="120"/>
+              <w:bottom w:type="dxa" w:w="100"/>
+              <w:right w:type="dxa" w:w="120"/>
+            </w:tcMar>
+          </w:tcPr>
+          <w:p>
+            <w:pPr>
+              <w:jc w:val="left"/>
+            </w:pPr>
+            <w:r>
+              <w:rPr>
+                <w:b w:val="false"/>
+                <w:bCs w:val="false"/>
+                <w:color w:val="000000"/>
+                <w:sz w:val="20"/>
+                <w:szCs w:val="20"/>
+              </w:rPr>
+              <w:t xml:space="preserve">TFF1</w:t>
+            </w:r>
+          </w:p>
+        </w:tc>
+        <w:tc>
+          <w:tcPr>
+            <w:tcW w:type="dxa" w:w="3480"/>
+            <w:tcMar>
+              <w:top w:type="dxa" w:w="100"/>
+              <w:left w:type="dxa" w:w="120"/>
+              <w:bottom w:type="dxa" w:w="100"/>
+              <w:right w:type="dxa" w:w="120"/>
+            </w:tcMar>
+          </w:tcPr>
+          <w:p>
+            <w:pPr>
+              <w:jc w:val="left"/>
+            </w:pPr>
+            <w:r>
+              <w:rPr>
+                <w:b w:val="false"/>
+                <w:bCs w:val="false"/>
+                <w:color w:val="000000"/>
+                <w:sz w:val="20"/>
+                <w:szCs w:val="20"/>
+              </w:rPr>
+              <w:t xml:space="preserve">0.244 (rank 2)</w:t>
+            </w:r>
+          </w:p>
+        </w:tc>
+        <w:tc>
+          <w:tcPr>
+            <w:tcW w:type="dxa" w:w="3480"/>
+            <w:tcMar>
+              <w:top w:type="dxa" w:w="100"/>
+              <w:left w:type="dxa" w:w="120"/>
+              <w:bottom w:type="dxa" w:w="100"/>
+              <w:right w:type="dxa" w:w="120"/>
+            </w:tcMar>
+          </w:tcPr>
+          <w:p>
+            <w:pPr>
+              <w:jc w:val="left"/>
+            </w:pPr>
+            <w:r>
+              <w:rPr>
+                <w:b w:val="false"/>
+                <w:bCs w:val="false"/>
+                <w:color w:val="000000"/>
+                <w:sz w:val="20"/>
+                <w:szCs w:val="20"/>
+              </w:rPr>
+              <w:t xml:space="preserve">Among top discriminators</w:t>
+            </w:r>
+          </w:p>
+        </w:tc>
+      </w:tr>
+      <w:tr>
+        <w:tc>
+          <w:tcPr>
+            <w:tcW w:type="dxa" w:w="2400"/>
+            <w:tcMar>
+              <w:top w:type="dxa" w:w="100"/>
+              <w:left w:type="dxa" w:w="120"/>
+              <w:bottom w:type="dxa" w:w="100"/>
+              <w:right w:type="dxa" w:w="120"/>
+            </w:tcMar>
+          </w:tcPr>
+          <w:p>
+            <w:pPr>
+              <w:jc w:val="left"/>
+            </w:pPr>
+            <w:r>
+              <w:rPr>
+                <w:b w:val="false"/>
+                <w:bCs w:val="false"/>
+                <w:color w:val="000000"/>
+                <w:sz w:val="20"/>
+                <w:szCs w:val="20"/>
+              </w:rPr>
+              <w:t xml:space="preserve">Plasma CA19-9</w:t>
+            </w:r>
+          </w:p>
+        </w:tc>
+        <w:tc>
+          <w:tcPr>
+            <w:tcW w:type="dxa" w:w="3480"/>
+            <w:tcMar>
+              <w:top w:type="dxa" w:w="100"/>
+              <w:left w:type="dxa" w:w="120"/>
+              <w:bottom w:type="dxa" w:w="100"/>
+              <w:right w:type="dxa" w:w="120"/>
+            </w:tcMar>
+          </w:tcPr>
+          <w:p>
+            <w:pPr>
+              <w:jc w:val="left"/>
+            </w:pPr>
+            <w:r>
+              <w:rPr>
+                <w:b w:val="false"/>
+                <w:bCs w:val="false"/>
+                <w:color w:val="000000"/>
+                <w:sz w:val="20"/>
+                <w:szCs w:val="20"/>
+              </w:rPr>
+              <w:t xml:space="preserve">0.185 (rank 3)</w:t>
+            </w:r>
+          </w:p>
+        </w:tc>
+        <w:tc>
+          <w:tcPr>
+            <w:tcW w:type="dxa" w:w="3480"/>
+            <w:tcMar>
+              <w:top w:type="dxa" w:w="100"/>
+              <w:left w:type="dxa" w:w="120"/>
+              <w:bottom w:type="dxa" w:w="100"/>
+              <w:right w:type="dxa" w:w="120"/>
+            </w:tcMar>
+          </w:tcPr>
+          <w:p>
+            <w:pPr>
+              <w:jc w:val="left"/>
+            </w:pPr>
+            <w:r>
+              <w:rPr>
+                <w:b w:val="false"/>
+                <w:bCs w:val="false"/>
+                <w:color w:val="000000"/>
+                <w:sz w:val="20"/>
+                <w:szCs w:val="20"/>
+              </w:rPr>
+              <w:t xml:space="preserve">Weaker alone than combined panel</w:t>
+            </w:r>
+          </w:p>
+        </w:tc>
+      </w:tr>
+      <w:tr>
+        <w:tc>
+          <w:tcPr>
+            <w:tcW w:type="dxa" w:w="2400"/>
+            <w:tcMar>
+              <w:top w:type="dxa" w:w="100"/>
+              <w:left w:type="dxa" w:w="120"/>
+              <w:bottom w:type="dxa" w:w="100"/>
+              <w:right w:type="dxa" w:w="120"/>
+            </w:tcMar>
+          </w:tcPr>
+          <w:p>
+            <w:pPr>
+              <w:jc w:val="left"/>
+            </w:pPr>
+            <w:r>
+              <w:rPr>
+                <w:b w:val="false"/>
+                <w:bCs w:val="false"/>
+                <w:color w:val="000000"/>
+                <w:sz w:val="20"/>
+                <w:szCs w:val="20"/>
+              </w:rPr>
+              <w:t xml:space="preserve">LYVE1</w:t>
+            </w:r>
+          </w:p>
+        </w:tc>
+        <w:tc>
+          <w:tcPr>
+            <w:tcW w:type="dxa" w:w="3480"/>
+            <w:tcMar>
+              <w:top w:type="dxa" w:w="100"/>
+              <w:left w:type="dxa" w:w="120"/>
+              <w:bottom w:type="dxa" w:w="100"/>
+              <w:right w:type="dxa" w:w="120"/>
+            </w:tcMar>
+          </w:tcPr>
+          <w:p>
+            <w:pPr>
+              <w:jc w:val="left"/>
+            </w:pPr>
+            <w:r>
+              <w:rPr>
+                <w:b w:val="false"/>
+                <w:bCs w:val="false"/>
+                <w:color w:val="000000"/>
+                <w:sz w:val="20"/>
+                <w:szCs w:val="20"/>
+              </w:rPr>
+              <w:t xml:space="preserve">0.124 (rank 4)</w:t>
+            </w:r>
+          </w:p>
+        </w:tc>
+        <w:tc>
+          <w:tcPr>
+            <w:tcW w:type="dxa" w:w="3480"/>
+            <w:tcMar>
+              <w:top w:type="dxa" w:w="100"/>
+              <w:left w:type="dxa" w:w="120"/>
+              <w:bottom w:type="dxa" w:w="100"/>
+              <w:right w:type="dxa" w:w="120"/>
+            </w:tcMar>
+          </w:tcPr>
+          <w:p>
+            <w:pPr>
+              <w:jc w:val="left"/>
+            </w:pPr>
+            <w:r>
+              <w:rPr>
+                <w:b w:val="false"/>
+                <w:bCs w:val="false"/>
+                <w:color w:val="000000"/>
+                <w:sz w:val="20"/>
+                <w:szCs w:val="20"/>
+              </w:rPr>
+              <w:t xml:space="preserve">Contributory, secondary signal</w:t>
+            </w:r>
+          </w:p>
+        </w:tc>
+      </w:tr>
+    </w:tbl>
+    <w:p>
+      <w:pPr>
+        <w:spacing w:after="200"/>
+      </w:pPr>
+    </w:p>
+    <w:p>
+      <w:pPr>
+        <w:spacing w:after="200" w:line="360"/>
+        <w:jc w:val="both"/>
+      </w:pPr>
+      <w:r>
+        <w:rPr>
+          <w:sz w:val="22"/>
+          <w:szCs w:val="22"/>
+        </w:rPr>
+        <w:t xml:space="preserve">This agreement between an independently trained model and previously published clinical findings gives face validity to the classifier: it demonstrates that the Random Forest is recovering the same underlying biological signal identified in the clinical literature, rather than fitting artifacts specific to this dataset.</w:t>
       </w:r>
     </w:p>
     <w:p>
@@ -1727,7 +2735,7 @@
           <w:sz w:val="22"/>
           <w:szCs w:val="22"/>
         </w:rPr>
-        <w:t xml:space="preserve">This project demonstrates that a Random Forest classifier, trained on the urinary and plasma biomarker panel established by Debernardi et al. [1] and built according to the algorithmic principles set out by Breiman [2], can distinguish Control, Benign, and PDAC diagnostic groups with 91.5% accuracy and a macro-averaged ROC-AUC of 0.983. Feature-importance analysis identifies REG1B, TFF1, and CA19-9 as the most clinically informative biomarkers, consistent with prior clinical findings. Future work should prioritize (i) permutation and SHAP-based importance as a cross-check on the Gini-based ranking, (ii) leave-one-cohort-out validation across collection sites, (iii) a focused evaluation on early-stage-only PDAC (Stage I/II) detection, which is the highest-value and most clinically demanding use case, and (iv) probability calibration if model outputs are to inform an actual clinical decision threshold.</w:t>
+        <w:t xml:space="preserve">This project demonstrates that a Random Forest classifier, trained on the urinary and plasma biomarker panel established by Debernardi et al. [1] and built according to the ensemble methodology of Breiman [2], can distinguish Control, Benign, and PDAC diagnostic groups with 91.5% accuracy and a macro-averaged ROC-AUC of 0.983. Confusion-matrix and ROC analysis show that the model separates PDAC from Control almost perfectly, with the majority of residual error concentrated on the harder Benign-vs-cancer boundary. Feature-importance analysis identifies REG1B, TFF1, and CA19-9 as the most clinically informative biomarkers, a ranking that agrees with prior clinical findings and thereby lends face validity to the trained model. Future work should prioritize (i) permutation and SHAP-based importance as a cross-check on the Gini-based ranking, (ii) leave-one-cohort-out validation across collection sites, (iii) a focused evaluation on early-stage-only PDAC (Stage I/II) detection, which is the highest-value and most clinically demanding use case, and (iv) probability calibration if model outputs are to inform an actual clinical decision threshold.</w:t>
       </w:r>
     </w:p>
     <w:p>
@@ -2042,17 +3050,6 @@
     <w:rPr>
       <w:sz w:val="56"/>
       <w:szCs w:val="56"/>
-    </w:rPr>
-  </w:style>
-  <w:style w:type="paragraph" w:styleId="Heading3">
-    <w:name w:val="Heading 3"/>
-    <w:basedOn w:val="Normal"/>
-    <w:next w:val="Normal"/>
-    <w:qFormat/>
-    <w:rPr>
-      <w:color w:val="1F4D78"/>
-      <w:sz w:val="24"/>
-      <w:szCs w:val="24"/>
     </w:rPr>
   </w:style>
   <w:style w:type="paragraph" w:styleId="Heading4">
@@ -2215,6 +3212,23 @@
       <w:color w:val="4B2E83"/>
       <w:sz w:val="24"/>
       <w:szCs w:val="24"/>
+    </w:rPr>
+  </w:style>
+  <w:style w:type="paragraph" w:styleId="Heading3">
+    <w:name w:val="Heading 3"/>
+    <w:basedOn w:val="Normal"/>
+    <w:next w:val="Normal"/>
+    <w:qFormat/>
+    <w:pPr>
+      <w:spacing w:after="100" w:before="200"/>
+    </w:pPr>
+    <w:rPr>
+      <w:rFonts w:ascii="Calibri" w:cs="Calibri" w:eastAsia="Calibri" w:hAnsi="Calibri"/>
+      <w:b/>
+      <w:bCs/>
+      <w:color w:val="00A896"/>
+      <w:sz w:val="22"/>
+      <w:szCs w:val="22"/>
     </w:rPr>
   </w:style>
 </w:styles>

</xml_diff>

<commit_message>
Add team members to research paper title page; include PDF export
Team Members: Shaik Kareem (23261A6646), Swargam Vishwanath
(23261A6650). Also commits a PDF export of the paper alongside the
.docx for direct submission.

Co-Authored-By: Claude Sonnet 5 <noreply@anthropic.com>
Claude-Session: https://claude.ai/code/session_01CMkVmteteX65fXuoFCFHqx
</commit_message>
<xml_diff>
--- a/reports/research_paper.docx
+++ b/reports/research_paper.docx
@@ -59,7 +59,7 @@
     </w:p>
     <w:p>
       <w:pPr>
-        <w:spacing w:after="800"/>
+        <w:spacing w:after="400"/>
         <w:jc w:val="center"/>
       </w:pPr>
       <w:r>
@@ -69,6 +69,50 @@
           <w:szCs w:val="22"/>
         </w:rPr>
         <w:t xml:space="preserve">Department of Computer Science and Engineering (AI/ML)</w:t>
+      </w:r>
+    </w:p>
+    <w:p>
+      <w:pPr>
+        <w:spacing w:after="60"/>
+        <w:jc w:val="center"/>
+      </w:pPr>
+      <w:r>
+        <w:rPr>
+          <w:b/>
+          <w:bCs/>
+          <w:color w:val="2C1250"/>
+          <w:sz w:val="22"/>
+          <w:szCs w:val="22"/>
+        </w:rPr>
+        <w:t xml:space="preserve">Team Members</w:t>
+      </w:r>
+    </w:p>
+    <w:p>
+      <w:pPr>
+        <w:spacing w:after="20"/>
+        <w:jc w:val="center"/>
+      </w:pPr>
+      <w:r>
+        <w:rPr>
+          <w:color w:val="333333"/>
+          <w:sz w:val="22"/>
+          <w:szCs w:val="22"/>
+        </w:rPr>
+        <w:t xml:space="preserve">Shaik Kareem — 23261A6646</w:t>
+      </w:r>
+    </w:p>
+    <w:p>
+      <w:pPr>
+        <w:spacing w:after="500"/>
+        <w:jc w:val="center"/>
+      </w:pPr>
+      <w:r>
+        <w:rPr>
+          <w:color w:val="333333"/>
+          <w:sz w:val="22"/>
+          <w:szCs w:val="22"/>
+        </w:rPr>
+        <w:t xml:space="preserve">Swargam Vishwanath — 23261A6650</w:t>
       </w:r>
     </w:p>
     <w:p>

</xml_diff>